<commit_message>
Add section 2: how to connect repository and launch skill in Claude Code browser
- New section explains: open claude.ai, click Add Repository button above
  input field, connect youtube-collector-shiftAI repo, then type a trigger word
- Renumbered subsequent sections (2→3 ... 8→9) accordingly

Co-Authored-By: Claude Sonnet 4.6 <noreply@anthropic.com>
</commit_message>
<xml_diff>
--- a/使用ガイド.docx
+++ b/使用ガイド.docx
@@ -555,7 +555,506 @@
           <w:sz w:val="32"/>
           <w:szCs w:val="32"/>
         </w:rPr>
-        <w:t xml:space="preserve">2. リポジトリ構成</w:t>
+        <w:t xml:space="preserve">2. スキルの起動方法</w:t>
+      </w:r>
+    </w:p>
+    <w:p>
+      <w:pPr>
+        <w:spacing w:after="60" w:before="60"/>
+      </w:pPr>
+      <w:r>
+        <w:rPr>
+          <w:rFonts w:ascii="Arial" w:cs="Arial" w:eastAsia="Arial" w:hAnsi="Arial"/>
+          <w:sz w:val="22"/>
+          <w:szCs w:val="22"/>
+        </w:rPr>
+        <w:t xml:space="preserve">このスキルは Claude Code（ブラウザ版）からリポジトリを接続することで利用できます。以下の手順で設定してください。</w:t>
+      </w:r>
+    </w:p>
+    <w:p>
+      <w:pPr>
+        <w:spacing w:after="40" w:before="40"/>
+      </w:pPr>
+      <w:r>
+        <w:t xml:space="preserve"/>
+      </w:r>
+    </w:p>
+    <w:tbl>
+      <w:tblPr>
+        <w:tblW w:type="dxa" w:w="9026"/>
+        <w:tblBorders>
+          <w:top w:val="single" w:color="auto" w:sz="4"/>
+          <w:left w:val="single" w:color="auto" w:sz="4"/>
+          <w:bottom w:val="single" w:color="auto" w:sz="4"/>
+          <w:right w:val="single" w:color="auto" w:sz="4"/>
+          <w:insideH w:val="single" w:color="auto" w:sz="4"/>
+          <w:insideV w:val="single" w:color="auto" w:sz="4"/>
+        </w:tblBorders>
+      </w:tblPr>
+      <w:tblGrid>
+        <w:gridCol w:w="2800"/>
+        <w:gridCol w:w="6226"/>
+      </w:tblGrid>
+      <w:tr>
+        <w:trPr>
+          <w:tblHeader/>
+        </w:trPr>
+        <w:tc>
+          <w:tcPr>
+            <w:tcW w:type="dxa" w:w="2800"/>
+            <w:tcBorders>
+              <w:top w:val="single" w:color="CCCCCC" w:sz="1"/>
+              <w:left w:val="single" w:color="CCCCCC" w:sz="1"/>
+              <w:bottom w:val="single" w:color="CCCCCC" w:sz="1"/>
+              <w:right w:val="single" w:color="CCCCCC" w:sz="1"/>
+            </w:tcBorders>
+            <w:shd w:fill="2E75B6" w:val="clear"/>
+            <w:tcMar>
+              <w:top w:type="dxa" w:w="80"/>
+              <w:left w:type="dxa" w:w="120"/>
+              <w:bottom w:type="dxa" w:w="80"/>
+              <w:right w:type="dxa" w:w="120"/>
+            </w:tcMar>
+          </w:tcPr>
+          <w:p>
+            <w:r>
+              <w:rPr>
+                <w:rFonts w:ascii="Arial" w:cs="Arial" w:eastAsia="Arial" w:hAnsi="Arial"/>
+                <w:b/>
+                <w:bCs/>
+                <w:color w:val="FFFFFF"/>
+                <w:sz w:val="20"/>
+                <w:szCs w:val="20"/>
+              </w:rPr>
+              <w:t xml:space="preserve">手順</w:t>
+            </w:r>
+          </w:p>
+        </w:tc>
+        <w:tc>
+          <w:tcPr>
+            <w:tcW w:type="dxa" w:w="6226"/>
+            <w:tcBorders>
+              <w:top w:val="single" w:color="CCCCCC" w:sz="1"/>
+              <w:left w:val="single" w:color="CCCCCC" w:sz="1"/>
+              <w:bottom w:val="single" w:color="CCCCCC" w:sz="1"/>
+              <w:right w:val="single" w:color="CCCCCC" w:sz="1"/>
+            </w:tcBorders>
+            <w:shd w:fill="2E75B6" w:val="clear"/>
+            <w:tcMar>
+              <w:top w:type="dxa" w:w="80"/>
+              <w:left w:type="dxa" w:w="120"/>
+              <w:bottom w:type="dxa" w:w="80"/>
+              <w:right w:type="dxa" w:w="120"/>
+            </w:tcMar>
+          </w:tcPr>
+          <w:p>
+            <w:r>
+              <w:rPr>
+                <w:rFonts w:ascii="Arial" w:cs="Arial" w:eastAsia="Arial" w:hAnsi="Arial"/>
+                <w:b/>
+                <w:bCs/>
+                <w:color w:val="FFFFFF"/>
+                <w:sz w:val="20"/>
+                <w:szCs w:val="20"/>
+              </w:rPr>
+              <w:t xml:space="preserve">操作</w:t>
+            </w:r>
+          </w:p>
+        </w:tc>
+      </w:tr>
+      <w:tr>
+        <w:tc>
+          <w:tcPr>
+            <w:tcW w:type="dxa" w:w="2800"/>
+            <w:tcBorders>
+              <w:top w:val="single" w:color="CCCCCC" w:sz="1"/>
+              <w:left w:val="single" w:color="CCCCCC" w:sz="1"/>
+              <w:bottom w:val="single" w:color="CCCCCC" w:sz="1"/>
+              <w:right w:val="single" w:color="CCCCCC" w:sz="1"/>
+            </w:tcBorders>
+            <w:shd w:fill="FFFFFF" w:val="clear"/>
+            <w:tcMar>
+              <w:top w:type="dxa" w:w="80"/>
+              <w:left w:type="dxa" w:w="120"/>
+              <w:bottom w:type="dxa" w:w="80"/>
+              <w:right w:type="dxa" w:w="120"/>
+            </w:tcMar>
+          </w:tcPr>
+          <w:p>
+            <w:r>
+              <w:rPr>
+                <w:rFonts w:ascii="Arial" w:cs="Arial" w:eastAsia="Arial" w:hAnsi="Arial"/>
+                <w:b w:val="false"/>
+                <w:bCs w:val="false"/>
+                <w:color w:val="000000"/>
+                <w:sz w:val="20"/>
+                <w:szCs w:val="20"/>
+              </w:rPr>
+              <w:t xml:space="preserve">① ブラウザで Claude Code を開く</w:t>
+            </w:r>
+          </w:p>
+        </w:tc>
+        <w:tc>
+          <w:tcPr>
+            <w:tcW w:type="dxa" w:w="6226"/>
+            <w:tcBorders>
+              <w:top w:val="single" w:color="CCCCCC" w:sz="1"/>
+              <w:left w:val="single" w:color="CCCCCC" w:sz="1"/>
+              <w:bottom w:val="single" w:color="CCCCCC" w:sz="1"/>
+              <w:right w:val="single" w:color="CCCCCC" w:sz="1"/>
+            </w:tcBorders>
+            <w:shd w:fill="FFFFFF" w:val="clear"/>
+            <w:tcMar>
+              <w:top w:type="dxa" w:w="80"/>
+              <w:left w:type="dxa" w:w="120"/>
+              <w:bottom w:type="dxa" w:w="80"/>
+              <w:right w:type="dxa" w:w="120"/>
+            </w:tcMar>
+          </w:tcPr>
+          <w:p>
+            <w:r>
+              <w:rPr>
+                <w:rFonts w:ascii="Arial" w:cs="Arial" w:eastAsia="Arial" w:hAnsi="Arial"/>
+                <w:b w:val="false"/>
+                <w:bCs w:val="false"/>
+                <w:color w:val="000000"/>
+                <w:sz w:val="20"/>
+                <w:szCs w:val="20"/>
+              </w:rPr>
+              <w:t xml:space="preserve">https://claude.ai を開き、Claude Code（または Claude に接続された Code 環境）を起動する</w:t>
+            </w:r>
+          </w:p>
+        </w:tc>
+      </w:tr>
+      <w:tr>
+        <w:tc>
+          <w:tcPr>
+            <w:tcW w:type="dxa" w:w="2800"/>
+            <w:tcBorders>
+              <w:top w:val="single" w:color="CCCCCC" w:sz="1"/>
+              <w:left w:val="single" w:color="CCCCCC" w:sz="1"/>
+              <w:bottom w:val="single" w:color="CCCCCC" w:sz="1"/>
+              <w:right w:val="single" w:color="CCCCCC" w:sz="1"/>
+            </w:tcBorders>
+            <w:shd w:fill="EBF3FA" w:val="clear"/>
+            <w:tcMar>
+              <w:top w:type="dxa" w:w="80"/>
+              <w:left w:type="dxa" w:w="120"/>
+              <w:bottom w:type="dxa" w:w="80"/>
+              <w:right w:type="dxa" w:w="120"/>
+            </w:tcMar>
+          </w:tcPr>
+          <w:p>
+            <w:r>
+              <w:rPr>
+                <w:rFonts w:ascii="Arial" w:cs="Arial" w:eastAsia="Arial" w:hAnsi="Arial"/>
+                <w:b w:val="false"/>
+                <w:bCs w:val="false"/>
+                <w:color w:val="000000"/>
+                <w:sz w:val="20"/>
+                <w:szCs w:val="20"/>
+              </w:rPr>
+              <w:t xml:space="preserve">② 「リポジトリを追加」ボタンをクリック</w:t>
+            </w:r>
+          </w:p>
+        </w:tc>
+        <w:tc>
+          <w:tcPr>
+            <w:tcW w:type="dxa" w:w="6226"/>
+            <w:tcBorders>
+              <w:top w:val="single" w:color="CCCCCC" w:sz="1"/>
+              <w:left w:val="single" w:color="CCCCCC" w:sz="1"/>
+              <w:bottom w:val="single" w:color="CCCCCC" w:sz="1"/>
+              <w:right w:val="single" w:color="CCCCCC" w:sz="1"/>
+            </w:tcBorders>
+            <w:shd w:fill="EBF3FA" w:val="clear"/>
+            <w:tcMar>
+              <w:top w:type="dxa" w:w="80"/>
+              <w:left w:type="dxa" w:w="120"/>
+              <w:bottom w:type="dxa" w:w="80"/>
+              <w:right w:type="dxa" w:w="120"/>
+            </w:tcMar>
+          </w:tcPr>
+          <w:p>
+            <w:r>
+              <w:rPr>
+                <w:rFonts w:ascii="Arial" w:cs="Arial" w:eastAsia="Arial" w:hAnsi="Arial"/>
+                <w:b w:val="false"/>
+                <w:bCs w:val="false"/>
+                <w:color w:val="000000"/>
+                <w:sz w:val="20"/>
+                <w:szCs w:val="20"/>
+              </w:rPr>
+              <w:t xml:space="preserve">チャット入力欄の上に表示されている「リポジトリを追加」ボタンをクリックする</w:t>
+            </w:r>
+          </w:p>
+        </w:tc>
+      </w:tr>
+      <w:tr>
+        <w:tc>
+          <w:tcPr>
+            <w:tcW w:type="dxa" w:w="2800"/>
+            <w:tcBorders>
+              <w:top w:val="single" w:color="CCCCCC" w:sz="1"/>
+              <w:left w:val="single" w:color="CCCCCC" w:sz="1"/>
+              <w:bottom w:val="single" w:color="CCCCCC" w:sz="1"/>
+              <w:right w:val="single" w:color="CCCCCC" w:sz="1"/>
+            </w:tcBorders>
+            <w:shd w:fill="FFFFFF" w:val="clear"/>
+            <w:tcMar>
+              <w:top w:type="dxa" w:w="80"/>
+              <w:left w:type="dxa" w:w="120"/>
+              <w:bottom w:type="dxa" w:w="80"/>
+              <w:right w:type="dxa" w:w="120"/>
+            </w:tcMar>
+          </w:tcPr>
+          <w:p>
+            <w:r>
+              <w:rPr>
+                <w:rFonts w:ascii="Arial" w:cs="Arial" w:eastAsia="Arial" w:hAnsi="Arial"/>
+                <w:b w:val="false"/>
+                <w:bCs w:val="false"/>
+                <w:color w:val="000000"/>
+                <w:sz w:val="20"/>
+                <w:szCs w:val="20"/>
+              </w:rPr>
+              <w:t xml:space="preserve">③ リポジトリを接続する</w:t>
+            </w:r>
+          </w:p>
+        </w:tc>
+        <w:tc>
+          <w:tcPr>
+            <w:tcW w:type="dxa" w:w="6226"/>
+            <w:tcBorders>
+              <w:top w:val="single" w:color="CCCCCC" w:sz="1"/>
+              <w:left w:val="single" w:color="CCCCCC" w:sz="1"/>
+              <w:bottom w:val="single" w:color="CCCCCC" w:sz="1"/>
+              <w:right w:val="single" w:color="CCCCCC" w:sz="1"/>
+            </w:tcBorders>
+            <w:shd w:fill="FFFFFF" w:val="clear"/>
+            <w:tcMar>
+              <w:top w:type="dxa" w:w="80"/>
+              <w:left w:type="dxa" w:w="120"/>
+              <w:bottom w:type="dxa" w:w="80"/>
+              <w:right w:type="dxa" w:w="120"/>
+            </w:tcMar>
+          </w:tcPr>
+          <w:p>
+            <w:r>
+              <w:rPr>
+                <w:rFonts w:ascii="Arial" w:cs="Arial" w:eastAsia="Arial" w:hAnsi="Arial"/>
+                <w:b w:val="false"/>
+                <w:bCs w:val="false"/>
+                <w:color w:val="000000"/>
+                <w:sz w:val="20"/>
+                <w:szCs w:val="20"/>
+              </w:rPr>
+              <w:t xml:space="preserve">以下のリポジトリURLを入力して接続する:
+https://github.com/aimaruai5-crypto/youtube-collector-shiftAI</w:t>
+            </w:r>
+          </w:p>
+        </w:tc>
+      </w:tr>
+      <w:tr>
+        <w:tc>
+          <w:tcPr>
+            <w:tcW w:type="dxa" w:w="2800"/>
+            <w:tcBorders>
+              <w:top w:val="single" w:color="CCCCCC" w:sz="1"/>
+              <w:left w:val="single" w:color="CCCCCC" w:sz="1"/>
+              <w:bottom w:val="single" w:color="CCCCCC" w:sz="1"/>
+              <w:right w:val="single" w:color="CCCCCC" w:sz="1"/>
+            </w:tcBorders>
+            <w:shd w:fill="EBF3FA" w:val="clear"/>
+            <w:tcMar>
+              <w:top w:type="dxa" w:w="80"/>
+              <w:left w:type="dxa" w:w="120"/>
+              <w:bottom w:type="dxa" w:w="80"/>
+              <w:right w:type="dxa" w:w="120"/>
+            </w:tcMar>
+          </w:tcPr>
+          <w:p>
+            <w:r>
+              <w:rPr>
+                <w:rFonts w:ascii="Arial" w:cs="Arial" w:eastAsia="Arial" w:hAnsi="Arial"/>
+                <w:b w:val="false"/>
+                <w:bCs w:val="false"/>
+                <w:color w:val="000000"/>
+                <w:sz w:val="20"/>
+                <w:szCs w:val="20"/>
+              </w:rPr>
+              <w:t xml:space="preserve">④ トリガーワードを入力する</w:t>
+            </w:r>
+          </w:p>
+        </w:tc>
+        <w:tc>
+          <w:tcPr>
+            <w:tcW w:type="dxa" w:w="6226"/>
+            <w:tcBorders>
+              <w:top w:val="single" w:color="CCCCCC" w:sz="1"/>
+              <w:left w:val="single" w:color="CCCCCC" w:sz="1"/>
+              <w:bottom w:val="single" w:color="CCCCCC" w:sz="1"/>
+              <w:right w:val="single" w:color="CCCCCC" w:sz="1"/>
+            </w:tcBorders>
+            <w:shd w:fill="EBF3FA" w:val="clear"/>
+            <w:tcMar>
+              <w:top w:type="dxa" w:w="80"/>
+              <w:left w:type="dxa" w:w="120"/>
+              <w:bottom w:type="dxa" w:w="80"/>
+              <w:right w:type="dxa" w:w="120"/>
+            </w:tcMar>
+          </w:tcPr>
+          <w:p>
+            <w:r>
+              <w:rPr>
+                <w:rFonts w:ascii="Arial" w:cs="Arial" w:eastAsia="Arial" w:hAnsi="Arial"/>
+                <w:b w:val="false"/>
+                <w:bCs w:val="false"/>
+                <w:color w:val="000000"/>
+                <w:sz w:val="20"/>
+                <w:szCs w:val="20"/>
+              </w:rPr>
+              <w:t xml:space="preserve">接続後、「動画を集めて」「新着動画を更新して」などのトリガーワード（6章参照）を入力するとスキルが自動実行される</w:t>
+            </w:r>
+          </w:p>
+        </w:tc>
+      </w:tr>
+    </w:tbl>
+    <w:p>
+      <w:pPr>
+        <w:spacing w:after="40" w:before="40"/>
+      </w:pPr>
+      <w:r>
+        <w:t xml:space="preserve"/>
+      </w:r>
+    </w:p>
+    <w:p>
+      <w:pPr>
+        <w:spacing w:after="60" w:before="60"/>
+      </w:pPr>
+      <w:r>
+        <w:rPr>
+          <w:rFonts w:ascii="Arial" w:cs="Arial" w:eastAsia="Arial" w:hAnsi="Arial"/>
+          <w:b/>
+          <w:bCs/>
+          <w:color w:val="1F4E79"/>
+          <w:sz w:val="22"/>
+          <w:szCs w:val="22"/>
+        </w:rPr>
+        <w:t xml:space="preserve">ポイント: リポジトリを一度接続すれば、以降は毎回接続し直す必要はありません。トリガーワードを入力するだけでスキルが起動します。</w:t>
+      </w:r>
+    </w:p>
+    <w:p>
+      <w:pPr>
+        <w:spacing w:after="40" w:before="40"/>
+      </w:pPr>
+      <w:r>
+        <w:t xml:space="preserve"/>
+      </w:r>
+    </w:p>
+    <w:tbl>
+      <w:tblPr>
+        <w:tblW w:type="dxa" w:w="9026"/>
+        <w:tblBorders>
+          <w:top w:val="single" w:color="auto" w:sz="4"/>
+          <w:left w:val="single" w:color="auto" w:sz="4"/>
+          <w:bottom w:val="single" w:color="auto" w:sz="4"/>
+          <w:right w:val="single" w:color="auto" w:sz="4"/>
+          <w:insideH w:val="single" w:color="auto" w:sz="4"/>
+          <w:insideV w:val="single" w:color="auto" w:sz="4"/>
+        </w:tblBorders>
+      </w:tblPr>
+      <w:tblGrid>
+        <w:gridCol w:w="1400"/>
+        <w:gridCol w:w="7626"/>
+      </w:tblGrid>
+      <w:tr>
+        <w:tc>
+          <w:tcPr>
+            <w:tcW w:type="dxa" w:w="1400"/>
+            <w:tcBorders>
+              <w:top w:val="single" w:color="CCCCCC" w:sz="1"/>
+              <w:left w:val="single" w:color="CCCCCC" w:sz="1"/>
+              <w:bottom w:val="single" w:color="CCCCCC" w:sz="1"/>
+              <w:right w:val="single" w:color="CCCCCC" w:sz="1"/>
+            </w:tcBorders>
+            <w:shd w:fill="2E75B6" w:val="clear"/>
+            <w:tcMar>
+              <w:top w:type="dxa" w:w="80"/>
+              <w:left w:type="dxa" w:w="120"/>
+              <w:bottom w:type="dxa" w:w="80"/>
+              <w:right w:type="dxa" w:w="120"/>
+            </w:tcMar>
+          </w:tcPr>
+          <w:p>
+            <w:r>
+              <w:rPr>
+                <w:rFonts w:ascii="Arial" w:cs="Arial" w:eastAsia="Arial" w:hAnsi="Arial"/>
+                <w:b/>
+                <w:bCs/>
+                <w:color w:val="FFFFFF"/>
+                <w:sz w:val="20"/>
+                <w:szCs w:val="20"/>
+              </w:rPr>
+              <w:t xml:space="preserve">リポジトリURL</w:t>
+            </w:r>
+          </w:p>
+        </w:tc>
+        <w:tc>
+          <w:tcPr>
+            <w:tcW w:type="dxa" w:w="7626"/>
+            <w:tcBorders>
+              <w:top w:val="single" w:color="CCCCCC" w:sz="1"/>
+              <w:left w:val="single" w:color="CCCCCC" w:sz="1"/>
+              <w:bottom w:val="single" w:color="CCCCCC" w:sz="1"/>
+              <w:right w:val="single" w:color="CCCCCC" w:sz="1"/>
+            </w:tcBorders>
+            <w:shd w:fill="EBF3FA" w:val="clear"/>
+            <w:tcMar>
+              <w:top w:type="dxa" w:w="80"/>
+              <w:left w:type="dxa" w:w="120"/>
+              <w:bottom w:type="dxa" w:w="80"/>
+              <w:right w:type="dxa" w:w="120"/>
+            </w:tcMar>
+          </w:tcPr>
+          <w:p>
+            <w:r>
+              <w:rPr>
+                <w:rFonts w:ascii="Courier New" w:cs="Courier New" w:eastAsia="Courier New" w:hAnsi="Courier New"/>
+                <w:sz w:val="18"/>
+                <w:szCs w:val="18"/>
+              </w:rPr>
+              <w:t xml:space="preserve">https://github.com/aimaruai5-crypto/youtube-collector-shiftAI</w:t>
+            </w:r>
+          </w:p>
+        </w:tc>
+      </w:tr>
+    </w:tbl>
+    <w:p>
+      <w:pPr>
+        <w:spacing w:after="40" w:before="40"/>
+      </w:pPr>
+      <w:r>
+        <w:t xml:space="preserve"/>
+      </w:r>
+    </w:p>
+    <w:p>
+      <w:pPr>
+        <w:pStyle w:val="Heading1"/>
+        <w:shd w:fill="1F4E79" w:val="clear"/>
+        <w:spacing w:after="160" w:before="300"/>
+        <w:ind w:left="240"/>
+      </w:pPr>
+      <w:r>
+        <w:rPr>
+          <w:rFonts w:ascii="Arial" w:cs="Arial" w:eastAsia="Arial" w:hAnsi="Arial"/>
+          <w:b/>
+          <w:bCs/>
+          <w:color w:val="FFFFFF"/>
+          <w:sz w:val="32"/>
+          <w:szCs w:val="32"/>
+        </w:rPr>
+        <w:t xml:space="preserve">3. リポジトリ構成</w:t>
       </w:r>
     </w:p>
     <w:p>
@@ -909,7 +1408,7 @@
           <w:sz w:val="32"/>
           <w:szCs w:val="32"/>
         </w:rPr>
-        <w:t xml:space="preserve">3. config.txt の設定項目</w:t>
+        <w:t xml:space="preserve">4. config.txt の設定項目</w:t>
       </w:r>
     </w:p>
     <w:p>
@@ -950,7 +1449,7 @@
           <w:sz w:val="26"/>
           <w:szCs w:val="26"/>
         </w:rPr>
-        <w:t xml:space="preserve">3-1. APPS_SCRIPT_URL</w:t>
+        <w:t xml:space="preserve">4-1. APPS_SCRIPT_URL</w:t>
       </w:r>
     </w:p>
     <w:p>
@@ -1210,7 +1709,7 @@
           <w:sz w:val="26"/>
           <w:szCs w:val="26"/>
         </w:rPr>
-        <w:t xml:space="preserve">3-2. SPREADSHEET_ID</w:t>
+        <w:t xml:space="preserve">4-2. SPREADSHEET_ID</w:t>
       </w:r>
     </w:p>
     <w:p>
@@ -1414,7 +1913,7 @@
           <w:sz w:val="32"/>
           <w:szCs w:val="32"/>
         </w:rPr>
-        <w:t xml:space="preserve">4. スキルの実行手順（自動処理フロー）</w:t>
+        <w:t xml:space="preserve">5. スキルの実行手順（自動処理フロー）</w:t>
       </w:r>
     </w:p>
     <w:p>
@@ -2577,7 +3076,7 @@
           <w:sz w:val="32"/>
           <w:szCs w:val="32"/>
         </w:rPr>
-        <w:t xml:space="preserve">5. トリガーワード一覧</w:t>
+        <w:t xml:space="preserve">6. トリガーワード一覧</w:t>
       </w:r>
     </w:p>
     <w:p>
@@ -3157,7 +3656,7 @@
           <w:sz w:val="32"/>
           <w:szCs w:val="32"/>
         </w:rPr>
-        <w:t xml:space="preserve">6. 別チャンネルへの対応方法</w:t>
+        <w:t xml:space="preserve">7. 別チャンネルへの対応方法</w:t>
       </w:r>
     </w:p>
     <w:p>
@@ -3457,7 +3956,7 @@
           <w:sz w:val="32"/>
           <w:szCs w:val="32"/>
         </w:rPr>
-        <w:t xml:space="preserve">7. トラブルシューティング</w:t>
+        <w:t xml:space="preserve">8. トラブルシューティング</w:t>
       </w:r>
     </w:p>
     <w:tbl>
@@ -3980,7 +4479,7 @@
           <w:sz w:val="32"/>
           <w:szCs w:val="32"/>
         </w:rPr>
-        <w:t xml:space="preserve">8. 関連リンク</w:t>
+        <w:t xml:space="preserve">9. 関連リンク</w:t>
       </w:r>
     </w:p>
     <w:p>
@@ -4000,7 +4499,7 @@
         </w:rPr>
         <w:t xml:space="preserve">GitHub リポジトリ: </w:t>
       </w:r>
-      <w:hyperlink w:history="1" r:id="rIdwznatekvfena8erymey4q">
+      <w:hyperlink w:history="1" r:id="rIdwh_6zeblersxdfpwnkpjx">
         <w:r>
           <w:rPr>
             <w:rStyle w:val="Hyperlink"/>
@@ -4029,7 +4528,7 @@
         </w:rPr>
         <w:t xml:space="preserve">Google Apps Script: </w:t>
       </w:r>
-      <w:hyperlink w:history="1" r:id="rIdbk3a-r7fqq8cvthskjwpj">
+      <w:hyperlink w:history="1" r:id="rIdaaq1yrha7tphzeec0dhoc">
         <w:r>
           <w:rPr>
             <w:rStyle w:val="Hyperlink"/>

</xml_diff>